<commit_message>
Fill both summative assignments to the full two-page allowance
Enriches the anchor and closing paragraphs of each chapter head while
keeping every paragraph within the required 5-7 sentence range, so the
body now uses the complete permitted scope without exceeding it.

Co-Authored-By: Claude Fable 5 <noreply@anthropic.com>
Claude-Session: https://claude.ai/code/session_01JBE53LuiqYDoXy9kPJLxew
</commit_message>
<xml_diff>
--- a/seminar-papers/עבודה מסכמת - קריאה וכתיבה אקדמית ב - ליני.docx
+++ b/seminar-papers/עבודה מסכמת - קריאה וכתיבה אקדמית ב - ליני.docx
@@ -269,7 +269,7 @@
         <w:ind w:left="709"/>
         <w:jc w:val="left"/>
       </w:pPr>
-      <w:hyperlink w:history="1" r:id="rIdzo2qoxel7ucyr5zovwtem">
+      <w:hyperlink w:history="1" r:id="rIduhxqgxe38xmvpc-hemr44">
         <w:r>
           <w:rPr>
             <w:rStyle w:val="Hyperlink"/>
@@ -306,7 +306,7 @@
         <w:ind w:left="709"/>
         <w:jc w:val="left"/>
       </w:pPr>
-      <w:hyperlink w:history="1" r:id="rIdmykjl44p_ncsplzytd6xw">
+      <w:hyperlink w:history="1" r:id="rIdfn3qd8dbzbv6_qifimaym">
         <w:r>
           <w:rPr>
             <w:rStyle w:val="Hyperlink"/>
@@ -343,7 +343,7 @@
         <w:ind w:left="709"/>
         <w:jc w:val="left"/>
       </w:pPr>
-      <w:hyperlink w:history="1" r:id="rIdltffa5yyhxi98842rngps">
+      <w:hyperlink w:history="1" r:id="rIdenttek-varljgaudp1f-v">
         <w:r>
           <w:rPr>
             <w:rStyle w:val="Hyperlink"/>
@@ -389,7 +389,7 @@
           <w:szCs w:val="24"/>
           <w:rtl/>
         </w:rPr>
-        <w:t xml:space="preserve">ראש פרק זה עוסק במימד הזמן של ההליך המשפטי ובפער שבין ייצוגו התרבותי לבין התמשכותו בפועל. התרבות הפופולרית מרגילה את צרכניה למשפט שנפתח ונסגר במהירות, ואילו ההליך הממשי נמדד בחודשים ובשנים. ההמתנה הזאת אינה שוות ערך עבור שני הצדדים: יש מי שיכול להרשות לעצמו לחכות, ויש מי שכל חודש נוסף שוחק אותו. הטענה המרכזית של הפרק היא שהפער בין הזמן התרבותי לזמן המוסדי אינו עניין אסתטי, אלא פער המעצב ציפיות, החלטות ויחסי כוח בין בעלי הדין. מי שלמד מהמסך שצדק מגיע מהר חווה את ההמתנה הממשית כהפרה של ההבטחה המשפטית. הפרק נשען על שלושה מקורות מן העשור האחרון: מחקר על ההימנעות מתביעות, קובץ השוואתי על ייצוג המשפט בטלוויזיה, ומחקר אמפירי ישראלי על העומס השיפוטי. שילובם יאפשר לבחון את הזמן המשפטי כזירה שנפגשים בה תרבות, מוסדות וכוח.</w:t>
+        <w:t xml:space="preserve">ראש פרק זה, החותם את סקירת הספרות של עבודת הסמינריון, עוסק במימד הזמן של ההליך המשפטי ובפער שבין ייצוגו התרבותי לבין התמשכותו בפועל. התרבות הפופולרית מרגילה את צרכניה למשפט שנפתח ונסגר במהירות של פרק טלוויזיה, ואילו ההליך הממשי, ובוודאי בתביעות עבודה, נמדד בחודשים ארוכים ולעיתים בשנים. ההמתנה הזאת אינה שוות ערך עבור שני הצדדים: יש מי שיכול להרשות לעצמו לחכות בנוחות, ויש מי שכל חודש נוסף שוחק את כיסו, את ראיותיו ואת כוחותיו הנפשיים. הטענה המרכזית של ראש הפרק היא שהפער בין הזמן התרבותי לזמן המוסדי אינו עניין אסתטי בלבד, אלא פער רב השלכות המעצב ציפיות, החלטות ויחסי כוח בין בעלי הדין. מי שלמד מן המסך שצדק מגיע מהר, חווה את ההמתנה הממשית לא כמהלכו הרגיל של הליך תקין אלא כהפרה של ההבטחה המשפטית עצמה. לביסוס הטענה נשען הפרק על שלושה מקורות מן העשור האחרון: מחקר על ההימנעות מתביעות ועל שורשיה, קובץ השוואתי על ייצוג המשפט בטלוויזיה במדינות שונות, ומחקר אמפירי ישראלי על העומס השיפוטי ועל דרכי צמצומו. שילובם יאפשר לבחון את הזמן המשפטי כזירה שנפגשים בה תרבות, מוסדות וכוח, ולהכין את הקרקע למענה על שאלת המחקר.</w:t>
       </w:r>
     </w:p>
     <w:p>
@@ -443,7 +443,7 @@
           <w:szCs w:val="24"/>
           <w:rtl/>
         </w:rPr>
-        <w:t xml:space="preserve">השורה התחתונה של ראש הפרק היא שהזמן המשפטי מחלק כוח: הוא מרתיע תובעים פוטנציאליים, שוחק את מי שבכל זאת תבע, ומשרת את הצד שיכול להמתין. התרבות הפופולרית, המציגה צדק מיידי, מסתירה את המנגנון הזה מעיני צרכניה. המחקר המוסדי, מנגד, מלמד שההתמשכות ניתנת למדידה ולשינוי, ולכן גם לאחריות. כך נוצר פער שיטתי בין הציפייה שההליך מייצר לבין החוויה שהוא מספק, פער שהמתדיין חווה לבדו. ראש פרק זה חותם את סקירת הספרות, ולכן הוא מוביל ישירות אל שאלת המחקר של העבודה: כיצד משתקף הפער בין הבניית "עשיית הצדק" בתרבות הפופולרית לבין מציאות הגבייה ויחסי הכוח בתביעות עבודה? הכלים שנפרשו בשלושת ראשי הפרקים יאפשרו לענות עליה באמצעות ניתוח מקרה הבוחן האישי.</w:t>
+        <w:t xml:space="preserve">השורה התחתונה של ראש הפרק היא שהזמן המשפטי מחלק כוח: הוא מרתיע תובעים פוטנציאליים מראש, שוחק את מי שבכל זאת תבע, ומשרת בשיטתיות את הצד שיכול להמתין. התרבות הפופולרית, המציגה צדק מיידי ומספק, מסתירה את המנגנון הזה מעיני צרכניה ומשאירה אותם לא מוכנים למפגש עימו. המחקר המוסדי, מנגד, מלמד שההתמשכות ניתנת למדידה, להשוואה ולשינוי, ולכן היא עניין של מדיניות ולא גזירת גורל. כך נחשף פער שיטתי בין הציפייה שההליך מייצר לבין החוויה שהוא מספק, פער שכל מתדיין מגלה לבדו וברגע הפגיע ביותר. ראש פרק זה חותם את סקירת הספרות, ולכן הוא מוביל ישירות אל שאלת המחקר של העבודה: כיצד משתקף הפער בין הבניית "עשיית הצדק" בתרבות הפופולרית לבין מציאות הגבייה ויחסי הכוח בתביעות עבודה? הכלים שנפרשו בשלושת ראשי הפרקים ישמשו לענות עליה באמצעות ניתוח מקרה הבוחן האישי.</w:t>
       </w:r>
     </w:p>
     <w:p>
@@ -515,7 +515,7 @@
         <w:ind w:left="709"/>
         <w:jc w:val="left"/>
       </w:pPr>
-      <w:hyperlink w:history="1" r:id="rIds1nwbvyy1uw9emxji-kye">
+      <w:hyperlink w:history="1" r:id="rIdu0z4zfmjb4pdx9lwfxorx">
         <w:r>
           <w:rPr>
             <w:rStyle w:val="Hyperlink"/>
@@ -576,7 +576,7 @@
         <w:ind w:left="709"/>
         <w:jc w:val="left"/>
       </w:pPr>
-      <w:hyperlink w:history="1" r:id="rIdo25svwxesll0uir8mn8a7">
+      <w:hyperlink w:history="1" r:id="rIdkdgi8o36wf9x5ty1b2pvl">
         <w:r>
           <w:rPr>
             <w:rStyle w:val="Hyperlink"/>
@@ -637,7 +637,7 @@
         <w:ind w:left="709"/>
         <w:jc w:val="left"/>
       </w:pPr>
-      <w:hyperlink w:history="1" r:id="rIdhffrbpv9ps-hogrixfbwu">
+      <w:hyperlink w:history="1" r:id="rIdd6ploipxxrx6yy36m4ryh">
         <w:r>
           <w:rPr>
             <w:rStyle w:val="Hyperlink"/>

</xml_diff>